<commit_message>
v1.6.1 - pyproject and technical doc. update
</commit_message>
<xml_diff>
--- a/docs/FocusTracer_Teknik_Dokumantasyon_v1.5.docx
+++ b/docs/FocusTracer_Teknik_Dokumantasyon_v1.5.docx
@@ -104,6 +104,12 @@
             <w:insideH w:val="single" w:color="auto" w:sz="4" w:space="0"/>
             <w:insideV w:val="single" w:color="auto" w:sz="4" w:space="0"/>
           </w:tblBorders>
+          <w:tblCellMar>
+            <w:top w:w="0" w:type="dxa"/>
+            <w:left w:w="108" w:type="dxa"/>
+            <w:bottom w:w="0" w:type="dxa"/>
+            <w:right w:w="108" w:type="dxa"/>
+          </w:tblCellMar>
         </w:tblPrEx>
         <w:trPr>
           <w:jc w:val="center"/>
@@ -220,7 +226,7 @@
                 <w:sz w:val="20"/>
                 <w:lang w:val="tr-TR"/>
               </w:rPr>
-              <w:t>v1.0</w:t>
+              <w:t>v1.1</w:t>
             </w:r>
             <w:bookmarkStart w:id="77" w:name="_GoBack"/>
             <w:bookmarkEnd w:id="77"/>
@@ -16289,9 +16295,28 @@
         </w:tc>
       </w:tr>
       <w:tr>
-        <w:tc>
-          <w:tcPr>
-            <w:tcW w:type="dxa" w:w="1984"/>
+        <w:tblPrEx>
+          <w:tblBorders>
+            <w:top w:val="single" w:color="auto" w:sz="4" w:space="0"/>
+            <w:left w:val="single" w:color="auto" w:sz="4" w:space="0"/>
+            <w:bottom w:val="single" w:color="auto" w:sz="4" w:space="0"/>
+            <w:right w:val="single" w:color="auto" w:sz="4" w:space="0"/>
+            <w:insideH w:val="single" w:color="auto" w:sz="4" w:space="0"/>
+            <w:insideV w:val="single" w:color="auto" w:sz="4" w:space="0"/>
+          </w:tblBorders>
+          <w:tblCellMar>
+            <w:top w:w="0" w:type="dxa"/>
+            <w:left w:w="108" w:type="dxa"/>
+            <w:bottom w:w="0" w:type="dxa"/>
+            <w:right w:w="108" w:type="dxa"/>
+          </w:tblCellMar>
+        </w:tblPrEx>
+        <w:trPr>
+          <w:jc w:val="center"/>
+        </w:trPr>
+        <w:tc>
+          <w:tcPr>
+            <w:tcW w:w="1984" w:type="dxa"/>
           </w:tcPr>
           <w:p>
             <w:r>
@@ -16301,7 +16326,7 @@
         </w:tc>
         <w:tc>
           <w:tcPr>
-            <w:tcW w:type="dxa" w:w="6520"/>
+            <w:tcW w:w="6520" w:type="dxa"/>
           </w:tcPr>
           <w:p>
             <w:r>
@@ -16311,9 +16336,28 @@
         </w:tc>
       </w:tr>
       <w:tr>
-        <w:tc>
-          <w:tcPr>
-            <w:tcW w:type="dxa" w:w="1984"/>
+        <w:tblPrEx>
+          <w:tblBorders>
+            <w:top w:val="single" w:color="auto" w:sz="4" w:space="0"/>
+            <w:left w:val="single" w:color="auto" w:sz="4" w:space="0"/>
+            <w:bottom w:val="single" w:color="auto" w:sz="4" w:space="0"/>
+            <w:right w:val="single" w:color="auto" w:sz="4" w:space="0"/>
+            <w:insideH w:val="single" w:color="auto" w:sz="4" w:space="0"/>
+            <w:insideV w:val="single" w:color="auto" w:sz="4" w:space="0"/>
+          </w:tblBorders>
+          <w:tblCellMar>
+            <w:top w:w="0" w:type="dxa"/>
+            <w:left w:w="108" w:type="dxa"/>
+            <w:bottom w:w="0" w:type="dxa"/>
+            <w:right w:w="108" w:type="dxa"/>
+          </w:tblCellMar>
+        </w:tblPrEx>
+        <w:trPr>
+          <w:jc w:val="center"/>
+        </w:trPr>
+        <w:tc>
+          <w:tcPr>
+            <w:tcW w:w="1984" w:type="dxa"/>
           </w:tcPr>
           <w:p>
             <w:r>
@@ -16323,7 +16367,7 @@
         </w:tc>
         <w:tc>
           <w:tcPr>
-            <w:tcW w:type="dxa" w:w="6520"/>
+            <w:tcW w:w="6520" w:type="dxa"/>
           </w:tcPr>
           <w:p>
             <w:r>
@@ -16333,9 +16377,28 @@
         </w:tc>
       </w:tr>
       <w:tr>
-        <w:tc>
-          <w:tcPr>
-            <w:tcW w:type="dxa" w:w="1984"/>
+        <w:tblPrEx>
+          <w:tblBorders>
+            <w:top w:val="single" w:color="auto" w:sz="4" w:space="0"/>
+            <w:left w:val="single" w:color="auto" w:sz="4" w:space="0"/>
+            <w:bottom w:val="single" w:color="auto" w:sz="4" w:space="0"/>
+            <w:right w:val="single" w:color="auto" w:sz="4" w:space="0"/>
+            <w:insideH w:val="single" w:color="auto" w:sz="4" w:space="0"/>
+            <w:insideV w:val="single" w:color="auto" w:sz="4" w:space="0"/>
+          </w:tblBorders>
+          <w:tblCellMar>
+            <w:top w:w="0" w:type="dxa"/>
+            <w:left w:w="108" w:type="dxa"/>
+            <w:bottom w:w="0" w:type="dxa"/>
+            <w:right w:w="108" w:type="dxa"/>
+          </w:tblCellMar>
+        </w:tblPrEx>
+        <w:trPr>
+          <w:jc w:val="center"/>
+        </w:trPr>
+        <w:tc>
+          <w:tcPr>
+            <w:tcW w:w="1984" w:type="dxa"/>
           </w:tcPr>
           <w:p>
             <w:r>
@@ -16345,7 +16408,7 @@
         </w:tc>
         <w:tc>
           <w:tcPr>
-            <w:tcW w:type="dxa" w:w="6520"/>
+            <w:tcW w:w="6520" w:type="dxa"/>
           </w:tcPr>
           <w:p>
             <w:r>
@@ -27701,9 +27764,28 @@
         </w:tc>
       </w:tr>
       <w:tr>
-        <w:tc>
-          <w:tcPr>
-            <w:tcW w:type="dxa" w:w="1020"/>
+        <w:tblPrEx>
+          <w:tblBorders>
+            <w:top w:val="single" w:color="auto" w:sz="4" w:space="0"/>
+            <w:left w:val="single" w:color="auto" w:sz="4" w:space="0"/>
+            <w:bottom w:val="single" w:color="auto" w:sz="4" w:space="0"/>
+            <w:right w:val="single" w:color="auto" w:sz="4" w:space="0"/>
+            <w:insideH w:val="single" w:color="auto" w:sz="4" w:space="0"/>
+            <w:insideV w:val="single" w:color="auto" w:sz="4" w:space="0"/>
+          </w:tblBorders>
+          <w:tblCellMar>
+            <w:top w:w="0" w:type="dxa"/>
+            <w:left w:w="108" w:type="dxa"/>
+            <w:bottom w:w="0" w:type="dxa"/>
+            <w:right w:w="108" w:type="dxa"/>
+          </w:tblCellMar>
+        </w:tblPrEx>
+        <w:trPr>
+          <w:jc w:val="center"/>
+        </w:trPr>
+        <w:tc>
+          <w:tcPr>
+            <w:tcW w:w="1020" w:type="dxa"/>
           </w:tcPr>
           <w:p>
             <w:r>
@@ -27713,7 +27795,7 @@
         </w:tc>
         <w:tc>
           <w:tcPr>
-            <w:tcW w:type="dxa" w:w="2494"/>
+            <w:tcW w:w="2494" w:type="dxa"/>
           </w:tcPr>
           <w:p>
             <w:r>
@@ -27723,7 +27805,7 @@
         </w:tc>
         <w:tc>
           <w:tcPr>
-            <w:tcW w:type="dxa" w:w="4989"/>
+            <w:tcW w:w="4989" w:type="dxa"/>
           </w:tcPr>
           <w:p>
             <w:r>
@@ -29368,6 +29450,12 @@
             <w:insideH w:val="single" w:color="auto" w:sz="4" w:space="0"/>
             <w:insideV w:val="single" w:color="auto" w:sz="4" w:space="0"/>
           </w:tblBorders>
+          <w:tblCellMar>
+            <w:top w:w="0" w:type="dxa"/>
+            <w:left w:w="108" w:type="dxa"/>
+            <w:bottom w:w="0" w:type="dxa"/>
+            <w:right w:w="108" w:type="dxa"/>
+          </w:tblCellMar>
         </w:tblPrEx>
         <w:trPr>
           <w:jc w:val="center"/>
@@ -33797,9 +33885,28 @@
         </w:tc>
       </w:tr>
       <w:tr>
-        <w:tc>
-          <w:tcPr>
-            <w:tcW w:type="dxa" w:w="1361"/>
+        <w:tblPrEx>
+          <w:tblBorders>
+            <w:top w:val="single" w:color="auto" w:sz="4" w:space="0"/>
+            <w:left w:val="single" w:color="auto" w:sz="4" w:space="0"/>
+            <w:bottom w:val="single" w:color="auto" w:sz="4" w:space="0"/>
+            <w:right w:val="single" w:color="auto" w:sz="4" w:space="0"/>
+            <w:insideH w:val="single" w:color="auto" w:sz="4" w:space="0"/>
+            <w:insideV w:val="single" w:color="auto" w:sz="4" w:space="0"/>
+          </w:tblBorders>
+          <w:tblCellMar>
+            <w:top w:w="0" w:type="dxa"/>
+            <w:left w:w="108" w:type="dxa"/>
+            <w:bottom w:w="0" w:type="dxa"/>
+            <w:right w:w="108" w:type="dxa"/>
+          </w:tblCellMar>
+        </w:tblPrEx>
+        <w:trPr>
+          <w:jc w:val="center"/>
+        </w:trPr>
+        <w:tc>
+          <w:tcPr>
+            <w:tcW w:w="1361" w:type="dxa"/>
           </w:tcPr>
           <w:p>
             <w:r>
@@ -33809,7 +33916,7 @@
         </w:tc>
         <w:tc>
           <w:tcPr>
-            <w:tcW w:type="dxa" w:w="7143"/>
+            <w:tcW w:w="7143" w:type="dxa"/>
           </w:tcPr>
           <w:p>
             <w:r>
@@ -33819,9 +33926,28 @@
         </w:tc>
       </w:tr>
       <w:tr>
-        <w:tc>
-          <w:tcPr>
-            <w:tcW w:type="dxa" w:w="1361"/>
+        <w:tblPrEx>
+          <w:tblBorders>
+            <w:top w:val="single" w:color="auto" w:sz="4" w:space="0"/>
+            <w:left w:val="single" w:color="auto" w:sz="4" w:space="0"/>
+            <w:bottom w:val="single" w:color="auto" w:sz="4" w:space="0"/>
+            <w:right w:val="single" w:color="auto" w:sz="4" w:space="0"/>
+            <w:insideH w:val="single" w:color="auto" w:sz="4" w:space="0"/>
+            <w:insideV w:val="single" w:color="auto" w:sz="4" w:space="0"/>
+          </w:tblBorders>
+          <w:tblCellMar>
+            <w:top w:w="0" w:type="dxa"/>
+            <w:left w:w="108" w:type="dxa"/>
+            <w:bottom w:w="0" w:type="dxa"/>
+            <w:right w:w="108" w:type="dxa"/>
+          </w:tblCellMar>
+        </w:tblPrEx>
+        <w:trPr>
+          <w:jc w:val="center"/>
+        </w:trPr>
+        <w:tc>
+          <w:tcPr>
+            <w:tcW w:w="1361" w:type="dxa"/>
           </w:tcPr>
           <w:p>
             <w:r>
@@ -33831,7 +33957,7 @@
         </w:tc>
         <w:tc>
           <w:tcPr>
-            <w:tcW w:type="dxa" w:w="7143"/>
+            <w:tcW w:w="7143" w:type="dxa"/>
           </w:tcPr>
           <w:p>
             <w:r>
@@ -33841,9 +33967,28 @@
         </w:tc>
       </w:tr>
       <w:tr>
-        <w:tc>
-          <w:tcPr>
-            <w:tcW w:type="dxa" w:w="1361"/>
+        <w:tblPrEx>
+          <w:tblBorders>
+            <w:top w:val="single" w:color="auto" w:sz="4" w:space="0"/>
+            <w:left w:val="single" w:color="auto" w:sz="4" w:space="0"/>
+            <w:bottom w:val="single" w:color="auto" w:sz="4" w:space="0"/>
+            <w:right w:val="single" w:color="auto" w:sz="4" w:space="0"/>
+            <w:insideH w:val="single" w:color="auto" w:sz="4" w:space="0"/>
+            <w:insideV w:val="single" w:color="auto" w:sz="4" w:space="0"/>
+          </w:tblBorders>
+          <w:tblCellMar>
+            <w:top w:w="0" w:type="dxa"/>
+            <w:left w:w="108" w:type="dxa"/>
+            <w:bottom w:w="0" w:type="dxa"/>
+            <w:right w:w="108" w:type="dxa"/>
+          </w:tblCellMar>
+        </w:tblPrEx>
+        <w:trPr>
+          <w:jc w:val="center"/>
+        </w:trPr>
+        <w:tc>
+          <w:tcPr>
+            <w:tcW w:w="1361" w:type="dxa"/>
           </w:tcPr>
           <w:p>
             <w:r>
@@ -33853,7 +33998,7 @@
         </w:tc>
         <w:tc>
           <w:tcPr>
-            <w:tcW w:type="dxa" w:w="7143"/>
+            <w:tcW w:w="7143" w:type="dxa"/>
           </w:tcPr>
           <w:p>
             <w:r>
@@ -33863,9 +34008,28 @@
         </w:tc>
       </w:tr>
       <w:tr>
-        <w:tc>
-          <w:tcPr>
-            <w:tcW w:type="dxa" w:w="1361"/>
+        <w:tblPrEx>
+          <w:tblBorders>
+            <w:top w:val="single" w:color="auto" w:sz="4" w:space="0"/>
+            <w:left w:val="single" w:color="auto" w:sz="4" w:space="0"/>
+            <w:bottom w:val="single" w:color="auto" w:sz="4" w:space="0"/>
+            <w:right w:val="single" w:color="auto" w:sz="4" w:space="0"/>
+            <w:insideH w:val="single" w:color="auto" w:sz="4" w:space="0"/>
+            <w:insideV w:val="single" w:color="auto" w:sz="4" w:space="0"/>
+          </w:tblBorders>
+          <w:tblCellMar>
+            <w:top w:w="0" w:type="dxa"/>
+            <w:left w:w="108" w:type="dxa"/>
+            <w:bottom w:w="0" w:type="dxa"/>
+            <w:right w:w="108" w:type="dxa"/>
+          </w:tblCellMar>
+        </w:tblPrEx>
+        <w:trPr>
+          <w:jc w:val="center"/>
+        </w:trPr>
+        <w:tc>
+          <w:tcPr>
+            <w:tcW w:w="1361" w:type="dxa"/>
           </w:tcPr>
           <w:p>
             <w:r>
@@ -33875,7 +34039,7 @@
         </w:tc>
         <w:tc>
           <w:tcPr>
-            <w:tcW w:type="dxa" w:w="7143"/>
+            <w:tcW w:w="7143" w:type="dxa"/>
           </w:tcPr>
           <w:p>
             <w:r>
@@ -33885,9 +34049,28 @@
         </w:tc>
       </w:tr>
       <w:tr>
-        <w:tc>
-          <w:tcPr>
-            <w:tcW w:type="dxa" w:w="1361"/>
+        <w:tblPrEx>
+          <w:tblBorders>
+            <w:top w:val="single" w:color="auto" w:sz="4" w:space="0"/>
+            <w:left w:val="single" w:color="auto" w:sz="4" w:space="0"/>
+            <w:bottom w:val="single" w:color="auto" w:sz="4" w:space="0"/>
+            <w:right w:val="single" w:color="auto" w:sz="4" w:space="0"/>
+            <w:insideH w:val="single" w:color="auto" w:sz="4" w:space="0"/>
+            <w:insideV w:val="single" w:color="auto" w:sz="4" w:space="0"/>
+          </w:tblBorders>
+          <w:tblCellMar>
+            <w:top w:w="0" w:type="dxa"/>
+            <w:left w:w="108" w:type="dxa"/>
+            <w:bottom w:w="0" w:type="dxa"/>
+            <w:right w:w="108" w:type="dxa"/>
+          </w:tblCellMar>
+        </w:tblPrEx>
+        <w:trPr>
+          <w:jc w:val="center"/>
+        </w:trPr>
+        <w:tc>
+          <w:tcPr>
+            <w:tcW w:w="1361" w:type="dxa"/>
           </w:tcPr>
           <w:p>
             <w:r>
@@ -33897,7 +34080,7 @@
         </w:tc>
         <w:tc>
           <w:tcPr>
-            <w:tcW w:type="dxa" w:w="7143"/>
+            <w:tcW w:w="7143" w:type="dxa"/>
           </w:tcPr>
           <w:p>
             <w:r>
@@ -33907,9 +34090,28 @@
         </w:tc>
       </w:tr>
       <w:tr>
-        <w:tc>
-          <w:tcPr>
-            <w:tcW w:type="dxa" w:w="1361"/>
+        <w:tblPrEx>
+          <w:tblBorders>
+            <w:top w:val="single" w:color="auto" w:sz="4" w:space="0"/>
+            <w:left w:val="single" w:color="auto" w:sz="4" w:space="0"/>
+            <w:bottom w:val="single" w:color="auto" w:sz="4" w:space="0"/>
+            <w:right w:val="single" w:color="auto" w:sz="4" w:space="0"/>
+            <w:insideH w:val="single" w:color="auto" w:sz="4" w:space="0"/>
+            <w:insideV w:val="single" w:color="auto" w:sz="4" w:space="0"/>
+          </w:tblBorders>
+          <w:tblCellMar>
+            <w:top w:w="0" w:type="dxa"/>
+            <w:left w:w="108" w:type="dxa"/>
+            <w:bottom w:w="0" w:type="dxa"/>
+            <w:right w:w="108" w:type="dxa"/>
+          </w:tblCellMar>
+        </w:tblPrEx>
+        <w:trPr>
+          <w:jc w:val="center"/>
+        </w:trPr>
+        <w:tc>
+          <w:tcPr>
+            <w:tcW w:w="1361" w:type="dxa"/>
           </w:tcPr>
           <w:p>
             <w:r>
@@ -33919,7 +34121,7 @@
         </w:tc>
         <w:tc>
           <w:tcPr>
-            <w:tcW w:type="dxa" w:w="7143"/>
+            <w:tcW w:w="7143" w:type="dxa"/>
           </w:tcPr>
           <w:p>
             <w:r>
@@ -33929,9 +34131,28 @@
         </w:tc>
       </w:tr>
       <w:tr>
-        <w:tc>
-          <w:tcPr>
-            <w:tcW w:type="dxa" w:w="1361"/>
+        <w:tblPrEx>
+          <w:tblBorders>
+            <w:top w:val="single" w:color="auto" w:sz="4" w:space="0"/>
+            <w:left w:val="single" w:color="auto" w:sz="4" w:space="0"/>
+            <w:bottom w:val="single" w:color="auto" w:sz="4" w:space="0"/>
+            <w:right w:val="single" w:color="auto" w:sz="4" w:space="0"/>
+            <w:insideH w:val="single" w:color="auto" w:sz="4" w:space="0"/>
+            <w:insideV w:val="single" w:color="auto" w:sz="4" w:space="0"/>
+          </w:tblBorders>
+          <w:tblCellMar>
+            <w:top w:w="0" w:type="dxa"/>
+            <w:left w:w="108" w:type="dxa"/>
+            <w:bottom w:w="0" w:type="dxa"/>
+            <w:right w:w="108" w:type="dxa"/>
+          </w:tblCellMar>
+        </w:tblPrEx>
+        <w:trPr>
+          <w:jc w:val="center"/>
+        </w:trPr>
+        <w:tc>
+          <w:tcPr>
+            <w:tcW w:w="1361" w:type="dxa"/>
           </w:tcPr>
           <w:p>
             <w:r>
@@ -33941,7 +34162,7 @@
         </w:tc>
         <w:tc>
           <w:tcPr>
-            <w:tcW w:type="dxa" w:w="7143"/>
+            <w:tcW w:w="7143" w:type="dxa"/>
           </w:tcPr>
           <w:p>
             <w:r>
@@ -34034,6 +34255,12 @@
             <w:insideH w:val="single" w:color="auto" w:sz="4" w:space="0"/>
             <w:insideV w:val="single" w:color="auto" w:sz="4" w:space="0"/>
           </w:tblBorders>
+          <w:tblCellMar>
+            <w:top w:w="0" w:type="dxa"/>
+            <w:left w:w="108" w:type="dxa"/>
+            <w:bottom w:w="0" w:type="dxa"/>
+            <w:right w:w="108" w:type="dxa"/>
+          </w:tblCellMar>
         </w:tblPrEx>
         <w:trPr>
           <w:jc w:val="center"/>
@@ -35211,130 +35438,104 @@
           <w:sz w:val="18"/>
         </w:rPr>
         <w:t>&lt;event type="line"&gt;</w:t>
-        <w:br/>
       </w:r>
       <w:r>
         <w:rPr>
           <w:rFonts w:ascii="Palatino Linotype" w:hAnsi="Palatino Linotype"/>
           <w:sz w:val="18"/>
         </w:rPr>
-        <w:t xml:space="preserve">  &lt;source&gt;total += v * 2&lt;/source&gt;</w:t>
-        <w:br/>
+        <w:br w:type="textWrapping"/>
       </w:r>
       <w:r>
         <w:rPr>
           <w:rFonts w:ascii="Palatino Linotype" w:hAnsi="Palatino Linotype"/>
           <w:sz w:val="18"/>
         </w:rPr>
-        <w:t xml:space="preserve">  &lt;reads&gt;</w:t>
-        <w:br/>
+        <w:t xml:space="preserve">  &lt;source&gt;total += v * 2&lt;/source&gt;</w:t>
       </w:r>
       <w:r>
         <w:rPr>
           <w:rFonts w:ascii="Palatino Linotype" w:hAnsi="Palatino Linotype"/>
           <w:sz w:val="18"/>
         </w:rPr>
-        <w:t xml:space="preserve">    &lt;read name="total" type="int"&gt;0&lt;/read&gt;</w:t>
-        <w:br/>
+        <w:br w:type="textWrapping"/>
       </w:r>
       <w:r>
         <w:rPr>
           <w:rFonts w:ascii="Palatino Linotype" w:hAnsi="Palatino Linotype"/>
           <w:sz w:val="18"/>
         </w:rPr>
-        <w:t xml:space="preserve">    &lt;read name="v" type="int"&gt;1&lt;/read&gt;</w:t>
-        <w:br/>
+        <w:t xml:space="preserve">  &lt;reads&gt;</w:t>
       </w:r>
       <w:r>
         <w:rPr>
           <w:rFonts w:ascii="Palatino Linotype" w:hAnsi="Palatino Linotype"/>
           <w:sz w:val="18"/>
         </w:rPr>
-        <w:t xml:space="preserve">  &lt;/reads&gt;</w:t>
-        <w:br/>
+        <w:br w:type="textWrapping"/>
       </w:r>
       <w:r>
         <w:rPr>
           <w:rFonts w:ascii="Palatino Linotype" w:hAnsi="Palatino Linotype"/>
           <w:sz w:val="18"/>
         </w:rPr>
-        <w:t xml:space="preserve">  &lt;delta&gt; ... &lt;/delta&gt;</w:t>
-        <w:br/>
+        <w:t xml:space="preserve">    &lt;read name="total" type="int"&gt;0&lt;/read&gt;</w:t>
       </w:r>
       <w:r>
         <w:rPr>
           <w:rFonts w:ascii="Palatino Linotype" w:hAnsi="Palatino Linotype"/>
           <w:sz w:val="18"/>
         </w:rPr>
-        <w:t>&lt;/event&gt;</w:t>
-      </w:r>
-    </w:p>
-    <w:p>
-      <w:pPr>
-        <w:pStyle w:val="3"/>
-      </w:pPr>
-      <w:r>
-        <w:t>17.3 slice — Backward Dynamic Slicing</w:t>
-      </w:r>
-    </w:p>
-    <w:p>
-      <w:r>
-        <w:t>slice komutu, bir slice kriterinden (hata noktası veya belirli bir değişken) geriye doğru, o değeri etkileyen ifade kümesini çıkarır. Trace, frame-farkındalıklı bir yürütme geçmişine düzleştirilir; her adımın use-kümesi &lt;reads&gt;'ten, def-kümesi satırın ast'ından (Store + AugAssign target) gelir — &lt;delta&gt; kullanılmaz, böylece delta'nın bir-event kayması dilimlemeyi etkilemez. İleri geçişte her kullanımın reaching definition'ı bulunur (veri bağımlılığı); parametreler çağrı yerine bağlanır (interprocedural). Kontrol bağımlılığı, kaynak ast'ından en yakın çevreleyen if/for/while başlığına yapısal olarak bağlanır. Kriterden geriye erişilebilirlik = slice. Sonuç &lt;slice&gt; olarak XML'e gömülür ve v2.3'e karşı doğrulanır (&lt;trace&gt;.sliced.xml).</w:t>
-      </w:r>
-    </w:p>
-    <w:p>
+        <w:br w:type="textWrapping"/>
+      </w:r>
       <w:r>
         <w:rPr>
           <w:rFonts w:ascii="Palatino Linotype" w:hAnsi="Palatino Linotype"/>
           <w:sz w:val="18"/>
         </w:rPr>
-        <w:t># Hatanın kök nedeni (varsayılan --at-exception):</w:t>
-        <w:br/>
+        <w:t xml:space="preserve">    &lt;read name="v" type="int"&gt;1&lt;/read&gt;</w:t>
       </w:r>
       <w:r>
         <w:rPr>
           <w:rFonts w:ascii="Palatino Linotype" w:hAnsi="Palatino Linotype"/>
           <w:sz w:val="18"/>
         </w:rPr>
-        <w:t>focustracer slice output/trace.xml --at-exception</w:t>
-        <w:br/>
+        <w:br w:type="textWrapping"/>
       </w:r>
       <w:r>
         <w:rPr>
           <w:rFonts w:ascii="Palatino Linotype" w:hAnsi="Palatino Linotype"/>
           <w:sz w:val="18"/>
         </w:rPr>
-        <w:br/>
+        <w:t xml:space="preserve">  &lt;/reads&gt;</w:t>
       </w:r>
       <w:r>
         <w:rPr>
           <w:rFonts w:ascii="Palatino Linotype" w:hAnsi="Palatino Linotype"/>
           <w:sz w:val="18"/>
         </w:rPr>
-        <w:t># Belirli bir değer: 42. satırdaki total'ı hangi ifadeler üretti?</w:t>
-        <w:br/>
+        <w:br w:type="textWrapping"/>
       </w:r>
       <w:r>
         <w:rPr>
           <w:rFonts w:ascii="Palatino Linotype" w:hAnsi="Palatino Linotype"/>
           <w:sz w:val="18"/>
         </w:rPr>
-        <w:t>focustracer slice output/trace.xml --at app.py:42:total</w:t>
-        <w:br/>
+        <w:t xml:space="preserve">  &lt;delta&gt; ... &lt;/delta&gt;</w:t>
       </w:r>
       <w:r>
         <w:rPr>
           <w:rFonts w:ascii="Palatino Linotype" w:hAnsi="Palatino Linotype"/>
           <w:sz w:val="18"/>
         </w:rPr>
-        <w:br/>
+        <w:br w:type="textWrapping"/>
       </w:r>
       <w:r>
         <w:rPr>
           <w:rFonts w:ascii="Palatino Linotype" w:hAnsi="Palatino Linotype"/>
           <w:sz w:val="18"/>
         </w:rPr>
-        <w:t># Çıktı işaretleri:  ◆ kriter   ▸ kontrol bağımlılığı   · veri bağımlılığı</w:t>
+        <w:t>&lt;/event&gt;</w:t>
       </w:r>
     </w:p>
     <w:p>
@@ -35342,12 +35543,12 @@
         <w:pStyle w:val="3"/>
       </w:pPr>
       <w:r>
-        <w:t>17.4 explain — Slice'tan LLM Kök-Neden Analizi</w:t>
-      </w:r>
-    </w:p>
-    <w:p>
-      <w:r>
-        <w:t>explain komutu bir slice hesaplar ve modele ham trace yerine slice'ı — nedensel zincir + her ifadenin okuduğu çalışma-anı değerleri — verir. Böylece küçük yerel bir model (örn. qwen2.5:3b) bile kök nedeni isabetle bulur. core.explain.build_slice_context bu bağlamı deterministik olarak üretir (LLM'siz test edilebilir; --show-context ile agent gerektirmeden görülebilir). Model çıktısı üç bölümdür: (1) kök neden, (2) düz dille nedensel zincir, (3) somut fix. Bu komut, v1.0'da ölü olan analyze_trace() metodunu bu amaçla canlandırır.</w:t>
+        <w:t>17.3 slice — Backward Dynamic Slicing</w:t>
+      </w:r>
+    </w:p>
+    <w:p>
+      <w:r>
+        <w:t>slice komutu, bir slice kriterinden (hata noktası veya belirli bir değişken) geriye doğru, o değeri etkileyen ifade kümesini çıkarır. Trace, frame-farkındalıklı bir yürütme geçmişine düzleştirilir; her adımın use-kümesi &lt;reads&gt;'ten, def-kümesi satırın ast'ından (Store + AugAssign target) gelir — &lt;delta&gt; kullanılmaz, böylece delta'nın bir-event kayması dilimlemeyi etkilemez. İleri geçişte her kullanımın reaching definition'ı bulunur (veri bağımlılığı); parametreler çağrı yerine bağlanır (interprocedural). Kontrol bağımlılığı, kaynak ast'ından en yakın çevreleyen if/for/while başlığına yapısal olarak bağlanır. Kriterden geriye erişilebilirlik = slice. Sonuç &lt;slice&gt; olarak XML'e gömülür ve v2.3'e karşı doğrulanır (&lt;trace&gt;.sliced.xml).</w:t>
       </w:r>
     </w:p>
     <w:p>
@@ -35356,120 +35557,266 @@
           <w:rFonts w:ascii="Palatino Linotype" w:hAnsi="Palatino Linotype"/>
           <w:sz w:val="18"/>
         </w:rPr>
-        <w:t>focustracer explain output/trace.xml --at-exception \</w:t>
-        <w:br/>
+        <w:t># Hatanın kök nedeni (varsayılan --at-exception):</w:t>
       </w:r>
       <w:r>
         <w:rPr>
           <w:rFonts w:ascii="Palatino Linotype" w:hAnsi="Palatino Linotype"/>
           <w:sz w:val="18"/>
         </w:rPr>
-        <w:t xml:space="preserve">  --model qwen2.5:3b --ollama-url http://localhost:11434</w:t>
-        <w:br/>
+        <w:br w:type="textWrapping"/>
       </w:r>
       <w:r>
         <w:rPr>
           <w:rFonts w:ascii="Palatino Linotype" w:hAnsi="Palatino Linotype"/>
           <w:sz w:val="18"/>
         </w:rPr>
-        <w:br/>
+        <w:t>focustracer slice output/trace.xml --at-exception</w:t>
       </w:r>
       <w:r>
         <w:rPr>
           <w:rFonts w:ascii="Palatino Linotype" w:hAnsi="Palatino Linotype"/>
           <w:sz w:val="18"/>
         </w:rPr>
-        <w:t># Modele giden slice bağlamını gör(offline, agent gerekmez):</w:t>
-        <w:br/>
+        <w:br w:type="textWrapping"/>
       </w:r>
       <w:r>
         <w:rPr>
           <w:rFonts w:ascii="Palatino Linotype" w:hAnsi="Palatino Linotype"/>
           <w:sz w:val="18"/>
         </w:rPr>
-        <w:t>focustracer explain output/trace.xml --at-exception --show-context</w:t>
-      </w:r>
-    </w:p>
-    <w:p>
-      <w:pPr>
-        <w:pStyle w:val="3"/>
-      </w:pPr>
-      <w:r>
-        <w:t>17.5 reverse — Reverse Execution / State Rewind</w:t>
-      </w:r>
-    </w:p>
-    <w:p>
-      <w:r>
-        <w:t>reverse komutu, GA'daki KIO2 tanımının diğer yarısını (reverse execution, rewind/replay, enhanced state recovery) karşılar. FocusTracer'ın &lt;delta&gt;'sı her değişimi tersinir kaydettiğinden, herhangi bir noktadaki gözlemlenebilir program state'i kaydedilmiş trace'ten türetilebilir — programı tekrar çalıştırmadan. core.reverse, trace'i frame-farkındalıklı yürütür ve her satırda frame'in state'ini yeniden kurar; detailed modda satırın tam &lt;locals&gt; snapshot'ını kullanır (kesin; delta offset'i ve loop-header boşluklarını atlar), aksi halde tersinir delta biriktirmeye düşer. Çıktı: hedefteki state tablosu + geriye doğru zaman çizelgesi; her adımda hangi değişkenin geri alındığını gösterir (undo total: 12 -&gt; 6) ve çağrı sınırlarını aşarak sarar.</w:t>
-      </w:r>
-    </w:p>
-    <w:p>
-      <w:r>
-        <w:t>Tasarım kararı: reverse, load gibi salt-okunur bir sorgu/görüntüleme komutudur. Şemaya dokunmaz ve trace'e hiçbir şey yazmaz — yeniden kurulan state türetilmiş veridir (delta'lar zaten kodlar); geri yazmak redundant olur ve trace'i şişirir. Trace, ne olduğunun değişmez kaydı olarak kalır. İstenirse --json ile yan dosyaya yazılır.</w:t>
-      </w:r>
-    </w:p>
-    <w:p>
+        <w:br w:type="textWrapping"/>
+      </w:r>
       <w:r>
         <w:rPr>
           <w:rFonts w:ascii="Palatino Linotype" w:hAnsi="Palatino Linotype"/>
           <w:sz w:val="18"/>
         </w:rPr>
-        <w:t># Crash anındaki state + geriye zaman çizelgesi:</w:t>
-        <w:br/>
+        <w:t># Belirli bir değer: 42. satırdaki total'ı hangi ifadeler üretti?</w:t>
       </w:r>
       <w:r>
         <w:rPr>
           <w:rFonts w:ascii="Palatino Linotype" w:hAnsi="Palatino Linotype"/>
           <w:sz w:val="18"/>
         </w:rPr>
-        <w:t>focustracer reverse output/trace.xml --at-exception --step-back 6</w:t>
-        <w:br/>
+        <w:br w:type="textWrapping"/>
       </w:r>
       <w:r>
         <w:rPr>
           <w:rFonts w:ascii="Palatino Linotype" w:hAnsi="Palatino Linotype"/>
           <w:sz w:val="18"/>
         </w:rPr>
-        <w:br/>
+        <w:t>focustracer slice output/trace.xml --at app.py:42:total</w:t>
       </w:r>
       <w:r>
         <w:rPr>
           <w:rFonts w:ascii="Palatino Linotype" w:hAnsi="Palatino Linotype"/>
           <w:sz w:val="18"/>
         </w:rPr>
-        <w:t># Belirli bir olay veya satır:</w:t>
-        <w:br/>
+        <w:br w:type="textWrapping"/>
       </w:r>
       <w:r>
         <w:rPr>
           <w:rFonts w:ascii="Palatino Linotype" w:hAnsi="Palatino Linotype"/>
           <w:sz w:val="18"/>
         </w:rPr>
-        <w:t>focustracer reverse output/trace.xml --at-event 18</w:t>
-        <w:br/>
+        <w:br w:type="textWrapping"/>
       </w:r>
       <w:r>
         <w:rPr>
           <w:rFonts w:ascii="Palatino Linotype" w:hAnsi="Palatino Linotype"/>
           <w:sz w:val="18"/>
         </w:rPr>
-        <w:t>focustracer reverse output/trace.xml --at-line 42 --function compute</w:t>
-        <w:br/>
-      </w:r>
+        <w:t># Çıktı işaretleri:  ◆ kriter   ▸ kontrol bağımlılığı   · veri bağımlılığı</w:t>
+      </w:r>
+    </w:p>
+    <w:p>
+      <w:pPr>
+        <w:pStyle w:val="3"/>
+      </w:pPr>
+      <w:r>
+        <w:t>17.4 explain — Slice'tan LLM Kök-Neden Analizi</w:t>
+      </w:r>
+    </w:p>
+    <w:p>
+      <w:r>
+        <w:t>explain komutu bir slice hesaplar ve modele ham trace yerine slice'ı — nedensel zincir + her ifadenin okuduğu çalışma-anı değerleri — verir. Böylece küçük yerel bir model (örn. qwen2.5:3b) bile kök nedeni isabetle bulur. core.explain.build_slice_context bu bağlamı deterministik olarak üretir (LLM'siz test edilebilir; --show-context ile agent gerektirmeden görülebilir). Model çıktısı üç bölümdür: (1) kök neden, (2) düz dille nedensel zincir, (3) somut fix. Bu komut, v1.0'da ölü olan analyze_trace() metodunu bu amaçla canlandırır.</w:t>
+      </w:r>
+    </w:p>
+    <w:p>
       <w:r>
         <w:rPr>
           <w:rFonts w:ascii="Palatino Linotype" w:hAnsi="Palatino Linotype"/>
           <w:sz w:val="18"/>
         </w:rPr>
-        <w:br/>
+        <w:t>focustracer explain output/trace.xml --at-exception \</w:t>
       </w:r>
       <w:r>
         <w:rPr>
           <w:rFonts w:ascii="Palatino Linotype" w:hAnsi="Palatino Linotype"/>
           <w:sz w:val="18"/>
         </w:rPr>
+        <w:br w:type="textWrapping"/>
+      </w:r>
+      <w:r>
+        <w:rPr>
+          <w:rFonts w:ascii="Palatino Linotype" w:hAnsi="Palatino Linotype"/>
+          <w:sz w:val="18"/>
+        </w:rPr>
+        <w:t xml:space="preserve">  --model qwen2.5:3b --ollama-url http://localhost:11434</w:t>
+      </w:r>
+      <w:r>
+        <w:rPr>
+          <w:rFonts w:ascii="Palatino Linotype" w:hAnsi="Palatino Linotype"/>
+          <w:sz w:val="18"/>
+        </w:rPr>
+        <w:br w:type="textWrapping"/>
+      </w:r>
+      <w:r>
+        <w:rPr>
+          <w:rFonts w:ascii="Palatino Linotype" w:hAnsi="Palatino Linotype"/>
+          <w:sz w:val="18"/>
+        </w:rPr>
+        <w:br w:type="textWrapping"/>
+      </w:r>
+      <w:r>
+        <w:rPr>
+          <w:rFonts w:ascii="Palatino Linotype" w:hAnsi="Palatino Linotype"/>
+          <w:sz w:val="18"/>
+        </w:rPr>
+        <w:t># Modele giden slice bağlamını gör(offline, agent gerekmez):</w:t>
+      </w:r>
+      <w:r>
+        <w:rPr>
+          <w:rFonts w:ascii="Palatino Linotype" w:hAnsi="Palatino Linotype"/>
+          <w:sz w:val="18"/>
+        </w:rPr>
+        <w:br w:type="textWrapping"/>
+      </w:r>
+      <w:r>
+        <w:rPr>
+          <w:rFonts w:ascii="Palatino Linotype" w:hAnsi="Palatino Linotype"/>
+          <w:sz w:val="18"/>
+        </w:rPr>
+        <w:t>focustracer explain output/trace.xml --at-exception --show-context</w:t>
+      </w:r>
+    </w:p>
+    <w:p>
+      <w:pPr>
+        <w:pStyle w:val="3"/>
+      </w:pPr>
+      <w:r>
+        <w:t>17.5 reverse — Reverse Execution / State Rewind</w:t>
+      </w:r>
+    </w:p>
+    <w:p>
+      <w:r>
+        <w:t>reverse komutu, GA'daki KIO2 tanımının diğer yarısını (reverse execution, rewind/replay, enhanced state recovery) karşılar. FocusTracer'ın &lt;delta&gt;'sı her değişimi tersinir kaydettiğinden, herhangi bir noktadaki gözlemlenebilir program state'i kaydedilmiş trace'ten türetilebilir — programı tekrar çalıştırmadan. core.reverse, trace'i frame-farkındalıklı yürütür ve her satırda frame'in state'ini yeniden kurar; detailed modda satırın tam &lt;locals&gt; snapshot'ını kullanır (kesin; delta offset'i ve loop-header boşluklarını atlar), aksi halde tersinir delta biriktirmeye düşer. Çıktı: hedefteki state tablosu + geriye doğru zaman çizelgesi; her adımda hangi değişkenin geri alındığını gösterir (undo total: 12 -&gt; 6) ve çağrı sınırlarını aşarak sarar.</w:t>
+      </w:r>
+    </w:p>
+    <w:p>
+      <w:r>
+        <w:t>Tasarım kararı: reverse, load gibi salt-okunur bir sorgu/görüntüleme komutudur. Şemaya dokunmaz ve trace'e hiçbir şey yazmaz — yeniden kurulan state türetilmiş veridir (delta'lar zaten kodlar); geri yazmak redundant olur ve trace'i şişirir. Trace, ne olduğunun değişmez kaydı olarak kalır. İstenirse --json ile yan dosyaya yazılır.</w:t>
+      </w:r>
+    </w:p>
+    <w:p>
+      <w:r>
+        <w:rPr>
+          <w:rFonts w:ascii="Palatino Linotype" w:hAnsi="Palatino Linotype"/>
+          <w:sz w:val="18"/>
+        </w:rPr>
+        <w:t># Crash anındaki state + geriye zaman çizelgesi:</w:t>
+      </w:r>
+      <w:r>
+        <w:rPr>
+          <w:rFonts w:ascii="Palatino Linotype" w:hAnsi="Palatino Linotype"/>
+          <w:sz w:val="18"/>
+        </w:rPr>
+        <w:br w:type="textWrapping"/>
+      </w:r>
+      <w:r>
+        <w:rPr>
+          <w:rFonts w:ascii="Palatino Linotype" w:hAnsi="Palatino Linotype"/>
+          <w:sz w:val="18"/>
+        </w:rPr>
+        <w:t>focustracer reverse output/trace.xml --at-exception --step-back 6</w:t>
+      </w:r>
+      <w:r>
+        <w:rPr>
+          <w:rFonts w:ascii="Palatino Linotype" w:hAnsi="Palatino Linotype"/>
+          <w:sz w:val="18"/>
+        </w:rPr>
+        <w:br w:type="textWrapping"/>
+      </w:r>
+      <w:r>
+        <w:rPr>
+          <w:rFonts w:ascii="Palatino Linotype" w:hAnsi="Palatino Linotype"/>
+          <w:sz w:val="18"/>
+        </w:rPr>
+        <w:br w:type="textWrapping"/>
+      </w:r>
+      <w:r>
+        <w:rPr>
+          <w:rFonts w:ascii="Palatino Linotype" w:hAnsi="Palatino Linotype"/>
+          <w:sz w:val="18"/>
+        </w:rPr>
+        <w:t># Belirli bir olay veya satır:</w:t>
+      </w:r>
+      <w:r>
+        <w:rPr>
+          <w:rFonts w:ascii="Palatino Linotype" w:hAnsi="Palatino Linotype"/>
+          <w:sz w:val="18"/>
+        </w:rPr>
+        <w:br w:type="textWrapping"/>
+      </w:r>
+      <w:r>
+        <w:rPr>
+          <w:rFonts w:ascii="Palatino Linotype" w:hAnsi="Palatino Linotype"/>
+          <w:sz w:val="18"/>
+        </w:rPr>
+        <w:t>focustracer reverse output/trace.xml --at-event 18</w:t>
+      </w:r>
+      <w:r>
+        <w:rPr>
+          <w:rFonts w:ascii="Palatino Linotype" w:hAnsi="Palatino Linotype"/>
+          <w:sz w:val="18"/>
+        </w:rPr>
+        <w:br w:type="textWrapping"/>
+      </w:r>
+      <w:r>
+        <w:rPr>
+          <w:rFonts w:ascii="Palatino Linotype" w:hAnsi="Palatino Linotype"/>
+          <w:sz w:val="18"/>
+        </w:rPr>
+        <w:t>focustracer reverse output/trace.xml --at-line 42 --function compute</w:t>
+      </w:r>
+      <w:r>
+        <w:rPr>
+          <w:rFonts w:ascii="Palatino Linotype" w:hAnsi="Palatino Linotype"/>
+          <w:sz w:val="18"/>
+        </w:rPr>
+        <w:br w:type="textWrapping"/>
+      </w:r>
+      <w:r>
+        <w:rPr>
+          <w:rFonts w:ascii="Palatino Linotype" w:hAnsi="Palatino Linotype"/>
+          <w:sz w:val="18"/>
+        </w:rPr>
+        <w:br w:type="textWrapping"/>
+      </w:r>
+      <w:r>
+        <w:rPr>
+          <w:rFonts w:ascii="Palatino Linotype" w:hAnsi="Palatino Linotype"/>
+          <w:sz w:val="18"/>
+        </w:rPr>
         <w:t># Yeniden kurulan state'i JSON'a dök:</w:t>
-        <w:br/>
+      </w:r>
+      <w:r>
+        <w:rPr>
+          <w:rFonts w:ascii="Palatino Linotype" w:hAnsi="Palatino Linotype"/>
+          <w:sz w:val="18"/>
+        </w:rPr>
+        <w:br w:type="textWrapping"/>
       </w:r>
       <w:r>
         <w:rPr>
@@ -35530,8 +35877,23 @@
     <w:tbl>
       <w:tblPr>
         <w:tblStyle w:val="37"/>
-        <w:tblW w:type="auto" w:w="0"/>
-        <w:tblLook w:firstColumn="1" w:firstRow="1" w:lastColumn="0" w:lastRow="0" w:noHBand="0" w:noVBand="1" w:val="04A0"/>
+        <w:tblW w:w="0" w:type="auto"/>
+        <w:tblInd w:w="0" w:type="dxa"/>
+        <w:tblBorders>
+          <w:top w:val="single" w:color="auto" w:sz="4" w:space="0"/>
+          <w:left w:val="single" w:color="auto" w:sz="4" w:space="0"/>
+          <w:bottom w:val="single" w:color="auto" w:sz="4" w:space="0"/>
+          <w:right w:val="single" w:color="auto" w:sz="4" w:space="0"/>
+          <w:insideH w:val="single" w:color="auto" w:sz="4" w:space="0"/>
+          <w:insideV w:val="single" w:color="auto" w:sz="4" w:space="0"/>
+        </w:tblBorders>
+        <w:tblLayout w:type="autofit"/>
+        <w:tblCellMar>
+          <w:top w:w="0" w:type="dxa"/>
+          <w:left w:w="108" w:type="dxa"/>
+          <w:bottom w:w="0" w:type="dxa"/>
+          <w:right w:w="108" w:type="dxa"/>
+        </w:tblCellMar>
       </w:tblPr>
       <w:tblGrid>
         <w:gridCol w:w="3168"/>
@@ -35539,9 +35901,25 @@
         <w:gridCol w:w="3168"/>
       </w:tblGrid>
       <w:tr>
-        <w:tc>
-          <w:tcPr>
-            <w:tcW w:type="dxa" w:w="3168"/>
+        <w:tblPrEx>
+          <w:tblBorders>
+            <w:top w:val="single" w:color="auto" w:sz="4" w:space="0"/>
+            <w:left w:val="single" w:color="auto" w:sz="4" w:space="0"/>
+            <w:bottom w:val="single" w:color="auto" w:sz="4" w:space="0"/>
+            <w:right w:val="single" w:color="auto" w:sz="4" w:space="0"/>
+            <w:insideH w:val="single" w:color="auto" w:sz="4" w:space="0"/>
+            <w:insideV w:val="single" w:color="auto" w:sz="4" w:space="0"/>
+          </w:tblBorders>
+          <w:tblCellMar>
+            <w:top w:w="0" w:type="dxa"/>
+            <w:left w:w="108" w:type="dxa"/>
+            <w:bottom w:w="0" w:type="dxa"/>
+            <w:right w:w="108" w:type="dxa"/>
+          </w:tblCellMar>
+        </w:tblPrEx>
+        <w:tc>
+          <w:tcPr>
+            <w:tcW w:w="3168" w:type="dxa"/>
           </w:tcPr>
           <w:p>
             <w:r>
@@ -35554,7 +35932,7 @@
         </w:tc>
         <w:tc>
           <w:tcPr>
-            <w:tcW w:type="dxa" w:w="3168"/>
+            <w:tcW w:w="3168" w:type="dxa"/>
           </w:tcPr>
           <w:p>
             <w:r>
@@ -35567,7 +35945,7 @@
         </w:tc>
         <w:tc>
           <w:tcPr>
-            <w:tcW w:type="dxa" w:w="3168"/>
+            <w:tcW w:w="3168" w:type="dxa"/>
           </w:tcPr>
           <w:p>
             <w:r>
@@ -35580,9 +35958,25 @@
         </w:tc>
       </w:tr>
       <w:tr>
-        <w:tc>
-          <w:tcPr>
-            <w:tcW w:type="dxa" w:w="3168"/>
+        <w:tblPrEx>
+          <w:tblBorders>
+            <w:top w:val="single" w:color="auto" w:sz="4" w:space="0"/>
+            <w:left w:val="single" w:color="auto" w:sz="4" w:space="0"/>
+            <w:bottom w:val="single" w:color="auto" w:sz="4" w:space="0"/>
+            <w:right w:val="single" w:color="auto" w:sz="4" w:space="0"/>
+            <w:insideH w:val="single" w:color="auto" w:sz="4" w:space="0"/>
+            <w:insideV w:val="single" w:color="auto" w:sz="4" w:space="0"/>
+          </w:tblBorders>
+          <w:tblCellMar>
+            <w:top w:w="0" w:type="dxa"/>
+            <w:left w:w="108" w:type="dxa"/>
+            <w:bottom w:w="0" w:type="dxa"/>
+            <w:right w:w="108" w:type="dxa"/>
+          </w:tblCellMar>
+        </w:tblPrEx>
+        <w:tc>
+          <w:tcPr>
+            <w:tcW w:w="3168" w:type="dxa"/>
           </w:tcPr>
           <w:p>
             <w:r>
@@ -35592,7 +35986,7 @@
         </w:tc>
         <w:tc>
           <w:tcPr>
-            <w:tcW w:type="dxa" w:w="3168"/>
+            <w:tcW w:w="3168" w:type="dxa"/>
           </w:tcPr>
           <w:p>
             <w:r>
@@ -35602,7 +35996,7 @@
         </w:tc>
         <w:tc>
           <w:tcPr>
-            <w:tcW w:type="dxa" w:w="3168"/>
+            <w:tcW w:w="3168" w:type="dxa"/>
           </w:tcPr>
           <w:p>
             <w:r>
@@ -35612,9 +36006,25 @@
         </w:tc>
       </w:tr>
       <w:tr>
-        <w:tc>
-          <w:tcPr>
-            <w:tcW w:type="dxa" w:w="3168"/>
+        <w:tblPrEx>
+          <w:tblBorders>
+            <w:top w:val="single" w:color="auto" w:sz="4" w:space="0"/>
+            <w:left w:val="single" w:color="auto" w:sz="4" w:space="0"/>
+            <w:bottom w:val="single" w:color="auto" w:sz="4" w:space="0"/>
+            <w:right w:val="single" w:color="auto" w:sz="4" w:space="0"/>
+            <w:insideH w:val="single" w:color="auto" w:sz="4" w:space="0"/>
+            <w:insideV w:val="single" w:color="auto" w:sz="4" w:space="0"/>
+          </w:tblBorders>
+          <w:tblCellMar>
+            <w:top w:w="0" w:type="dxa"/>
+            <w:left w:w="108" w:type="dxa"/>
+            <w:bottom w:w="0" w:type="dxa"/>
+            <w:right w:w="108" w:type="dxa"/>
+          </w:tblCellMar>
+        </w:tblPrEx>
+        <w:tc>
+          <w:tcPr>
+            <w:tcW w:w="3168" w:type="dxa"/>
           </w:tcPr>
           <w:p>
             <w:r>
@@ -35624,7 +36034,7 @@
         </w:tc>
         <w:tc>
           <w:tcPr>
-            <w:tcW w:type="dxa" w:w="3168"/>
+            <w:tcW w:w="3168" w:type="dxa"/>
           </w:tcPr>
           <w:p>
             <w:r>
@@ -35634,7 +36044,7 @@
         </w:tc>
         <w:tc>
           <w:tcPr>
-            <w:tcW w:type="dxa" w:w="3168"/>
+            <w:tcW w:w="3168" w:type="dxa"/>
           </w:tcPr>
           <w:p>
             <w:r>
@@ -35644,9 +36054,25 @@
         </w:tc>
       </w:tr>
       <w:tr>
-        <w:tc>
-          <w:tcPr>
-            <w:tcW w:type="dxa" w:w="3168"/>
+        <w:tblPrEx>
+          <w:tblBorders>
+            <w:top w:val="single" w:color="auto" w:sz="4" w:space="0"/>
+            <w:left w:val="single" w:color="auto" w:sz="4" w:space="0"/>
+            <w:bottom w:val="single" w:color="auto" w:sz="4" w:space="0"/>
+            <w:right w:val="single" w:color="auto" w:sz="4" w:space="0"/>
+            <w:insideH w:val="single" w:color="auto" w:sz="4" w:space="0"/>
+            <w:insideV w:val="single" w:color="auto" w:sz="4" w:space="0"/>
+          </w:tblBorders>
+          <w:tblCellMar>
+            <w:top w:w="0" w:type="dxa"/>
+            <w:left w:w="108" w:type="dxa"/>
+            <w:bottom w:w="0" w:type="dxa"/>
+            <w:right w:w="108" w:type="dxa"/>
+          </w:tblCellMar>
+        </w:tblPrEx>
+        <w:tc>
+          <w:tcPr>
+            <w:tcW w:w="3168" w:type="dxa"/>
           </w:tcPr>
           <w:p>
             <w:r>
@@ -35656,7 +36082,7 @@
         </w:tc>
         <w:tc>
           <w:tcPr>
-            <w:tcW w:type="dxa" w:w="3168"/>
+            <w:tcW w:w="3168" w:type="dxa"/>
           </w:tcPr>
           <w:p>
             <w:r>
@@ -35666,7 +36092,7 @@
         </w:tc>
         <w:tc>
           <w:tcPr>
-            <w:tcW w:type="dxa" w:w="3168"/>
+            <w:tcW w:w="3168" w:type="dxa"/>
           </w:tcPr>
           <w:p>
             <w:r>
@@ -36536,7 +36962,7 @@
     <w:lsdException w:qFormat="1" w:unhideWhenUsed="0" w:uiPriority="61" w:semiHidden="0" w:name="Light List Accent 2"/>
     <w:lsdException w:qFormat="1" w:unhideWhenUsed="0" w:uiPriority="62" w:semiHidden="0" w:name="Light Grid Accent 2"/>
     <w:lsdException w:qFormat="1" w:unhideWhenUsed="0" w:uiPriority="63" w:semiHidden="0" w:name="Medium Shading 1 Accent 2"/>
-    <w:lsdException w:unhideWhenUsed="0" w:uiPriority="64" w:semiHidden="0" w:name="Medium Shading 2 Accent 2"/>
+    <w:lsdException w:qFormat="1" w:unhideWhenUsed="0" w:uiPriority="64" w:semiHidden="0" w:name="Medium Shading 2 Accent 2"/>
     <w:lsdException w:unhideWhenUsed="0" w:uiPriority="65" w:semiHidden="0" w:name="Medium List 1 Accent 2"/>
     <w:lsdException w:qFormat="1" w:unhideWhenUsed="0" w:uiPriority="66" w:semiHidden="0" w:name="Medium List 2 Accent 2"/>
     <w:lsdException w:qFormat="1" w:unhideWhenUsed="0" w:uiPriority="67" w:semiHidden="0" w:name="Medium Grid 1 Accent 2"/>
@@ -36550,7 +36976,7 @@
     <w:lsdException w:qFormat="1" w:unhideWhenUsed="0" w:uiPriority="61" w:semiHidden="0" w:name="Light List Accent 3"/>
     <w:lsdException w:qFormat="1" w:unhideWhenUsed="0" w:uiPriority="62" w:semiHidden="0" w:name="Light Grid Accent 3"/>
     <w:lsdException w:qFormat="1" w:unhideWhenUsed="0" w:uiPriority="63" w:semiHidden="0" w:name="Medium Shading 1 Accent 3"/>
-    <w:lsdException w:unhideWhenUsed="0" w:uiPriority="64" w:semiHidden="0" w:name="Medium Shading 2 Accent 3"/>
+    <w:lsdException w:qFormat="1" w:unhideWhenUsed="0" w:uiPriority="64" w:semiHidden="0" w:name="Medium Shading 2 Accent 3"/>
     <w:lsdException w:unhideWhenUsed="0" w:uiPriority="65" w:semiHidden="0" w:name="Medium List 1 Accent 3"/>
     <w:lsdException w:qFormat="1" w:unhideWhenUsed="0" w:uiPriority="66" w:semiHidden="0" w:name="Medium List 2 Accent 3"/>
     <w:lsdException w:qFormat="1" w:unhideWhenUsed="0" w:uiPriority="67" w:semiHidden="0" w:name="Medium Grid 1 Accent 3"/>
@@ -36588,10 +37014,10 @@
     <w:lsdException w:unhideWhenUsed="0" w:uiPriority="71" w:semiHidden="0" w:name="Colorful Shading Accent 5"/>
     <w:lsdException w:qFormat="1" w:unhideWhenUsed="0" w:uiPriority="72" w:semiHidden="0" w:name="Colorful List Accent 5"/>
     <w:lsdException w:unhideWhenUsed="0" w:uiPriority="73" w:semiHidden="0" w:name="Colorful Grid Accent 5"/>
-    <w:lsdException w:unhideWhenUsed="0" w:uiPriority="60" w:semiHidden="0" w:name="Light Shading Accent 6"/>
+    <w:lsdException w:qFormat="1" w:unhideWhenUsed="0" w:uiPriority="60" w:semiHidden="0" w:name="Light Shading Accent 6"/>
     <w:lsdException w:qFormat="1" w:unhideWhenUsed="0" w:uiPriority="61" w:semiHidden="0" w:name="Light List Accent 6"/>
     <w:lsdException w:qFormat="1" w:unhideWhenUsed="0" w:uiPriority="62" w:semiHidden="0" w:name="Light Grid Accent 6"/>
-    <w:lsdException w:unhideWhenUsed="0" w:uiPriority="63" w:semiHidden="0" w:name="Medium Shading 1 Accent 6"/>
+    <w:lsdException w:qFormat="1" w:unhideWhenUsed="0" w:uiPriority="63" w:semiHidden="0" w:name="Medium Shading 1 Accent 6"/>
     <w:lsdException w:qFormat="1" w:unhideWhenUsed="0" w:uiPriority="64" w:semiHidden="0" w:name="Medium Shading 2 Accent 6"/>
     <w:lsdException w:qFormat="1" w:unhideWhenUsed="0" w:uiPriority="65" w:semiHidden="0" w:name="Medium List 1 Accent 6"/>
     <w:lsdException w:qFormat="1" w:unhideWhenUsed="0" w:uiPriority="66" w:semiHidden="0" w:name="Medium List 2 Accent 6"/>
@@ -37900,6 +38326,7 @@
   <w:style w:type="table" w:styleId="48">
     <w:name w:val="Light Shading Accent 6"/>
     <w:basedOn w:val="12"/>
+    <w:qFormat/>
     <w:uiPriority w:val="60"/>
     <w:pPr>
       <w:spacing w:after="0" w:line="240" w:lineRule="auto"/>
@@ -40194,6 +40621,7 @@
   <w:style w:type="table" w:styleId="69">
     <w:name w:val="Medium Shading 1 Accent 6"/>
     <w:basedOn w:val="12"/>
+    <w:qFormat/>
     <w:uiPriority w:val="63"/>
     <w:pPr>
       <w:spacing w:after="0" w:line="240" w:lineRule="auto"/>
@@ -40633,6 +41061,7 @@
   <w:style w:type="table" w:styleId="72">
     <w:name w:val="Medium Shading 2 Accent 2"/>
     <w:basedOn w:val="12"/>
+    <w:qFormat/>
     <w:uiPriority w:val="64"/>
     <w:pPr>
       <w:spacing w:after="0" w:line="240" w:lineRule="auto"/>
@@ -40798,6 +41227,7 @@
   <w:style w:type="table" w:styleId="73">
     <w:name w:val="Medium Shading 2 Accent 3"/>
     <w:basedOn w:val="12"/>
+    <w:qFormat/>
     <w:uiPriority w:val="64"/>
     <w:pPr>
       <w:spacing w:after="0" w:line="240" w:lineRule="auto"/>

</xml_diff>